<commit_message>
Add comprehensive master status table to Veri_Kaynaklari_Envanteri.docx
New section 9: single table covering all 26 data sources (live + blocked
+ under-evaluation) with Durum/Kaynak/Bilgi/Sebep/Cozum columns, so the
whole picture is visible in one place instead of split across sections
6/8. Includes today's findings: GDO SPI's WCS returning classified 0-4
codes instead of real float values, and which blockers are Python-service
solvable (GHSL, GDO SPI, GDO Soil Moisture/FAPAR, Meta/HDX) vs not
(INFORM Index, JRC GFM - process/redundancy issues, not technical ones).

Co-Authored-By: Claude Sonnet 5 <noreply@anthropic.com>
</commit_message>
<xml_diff>
--- a/docs/Veri_Kaynaklari_Envanteri.docx
+++ b/docs/Veri_Kaynaklari_Envanteri.docx
@@ -2329,6 +2329,2190 @@
         </w:tc>
       </w:tr>
     </w:tbl>
+    <w:p>
+      <w:r>
+        <w:br w:type="page"/>
+      </w:r>
+    </w:p>
+    <w:p>
+      <w:pPr>
+        <w:pStyle w:val="Heading1"/>
+      </w:pPr>
+      <w:r>
+        <w:t>9. Kapsamlı Durum Tablosu — Tüm Kaynaklar (Durum · Kaynak · Bilgi · Sebep · Çözüm)</w:t>
+      </w:r>
+    </w:p>
+    <w:p>
+      <w:r>
+        <w:rPr>
+          <w:i/>
+          <w:sz w:val="18"/>
+        </w:rPr>
+        <w:t>Bu tablo, önceki bölümlerdeki (1-8) tüm kaynakları TEK bir yerde, aynı beş sütunla özetler: canlı çalışanlar için Sebep/Çözüm sütunları boş bırakılmıştır (zaten çalışıyorlar); bloke ya da değerlendirme aşamasındaki kaynaklar için nedeni ve olası çözümü gösterir. 2026-07-20 sonu itibarıyla günceldir.</w:t>
+      </w:r>
+    </w:p>
+    <w:tbl>
+      <w:tblPr>
+        <w:tblW w:type="auto" w:w="0"/>
+        <w:tblLook w:firstColumn="1" w:firstRow="1" w:lastColumn="0" w:lastRow="0" w:noHBand="0" w:noVBand="1" w:val="04A0"/>
+        <w:tblBorders>
+          <w:top w:val="single" w:sz="4" w:color="auto"/>
+          <w:left w:val="single" w:sz="4" w:color="auto"/>
+          <w:bottom w:val="single" w:sz="4" w:color="auto"/>
+          <w:right w:val="single" w:sz="4" w:color="auto"/>
+          <w:insideH w:val="single" w:sz="4" w:color="auto"/>
+          <w:insideV w:val="single" w:sz="4" w:color="auto"/>
+        </w:tblBorders>
+      </w:tblPr>
+      <w:tblGrid>
+        <w:gridCol w:w="1872"/>
+        <w:gridCol w:w="1872"/>
+        <w:gridCol w:w="1872"/>
+        <w:gridCol w:w="1872"/>
+        <w:gridCol w:w="1872"/>
+      </w:tblGrid>
+      <w:tr>
+        <w:tc>
+          <w:tcPr>
+            <w:tcW w:type="dxa" w:w="1152"/>
+            <w:shd w:val="clear" w:color="auto" w:fill="2F5496"/>
+          </w:tcPr>
+          <w:p>
+            <w:r>
+              <w:rPr>
+                <w:color w:val="FFFFFF"/>
+              </w:rPr>
+            </w:r>
+            <w:r>
+              <w:rPr>
+                <w:b/>
+                <w:sz w:val="19"/>
+              </w:rPr>
+              <w:t>Durum</w:t>
+            </w:r>
+          </w:p>
+        </w:tc>
+        <w:tc>
+          <w:tcPr>
+            <w:tcW w:type="dxa" w:w="2160"/>
+            <w:shd w:val="clear" w:color="auto" w:fill="2F5496"/>
+          </w:tcPr>
+          <w:p>
+            <w:r>
+              <w:rPr>
+                <w:color w:val="FFFFFF"/>
+              </w:rPr>
+            </w:r>
+            <w:r>
+              <w:rPr>
+                <w:b/>
+                <w:sz w:val="19"/>
+              </w:rPr>
+              <w:t>Kaynak</w:t>
+            </w:r>
+          </w:p>
+        </w:tc>
+        <w:tc>
+          <w:tcPr>
+            <w:tcW w:type="dxa" w:w="2736"/>
+            <w:shd w:val="clear" w:color="auto" w:fill="2F5496"/>
+          </w:tcPr>
+          <w:p>
+            <w:r>
+              <w:rPr>
+                <w:color w:val="FFFFFF"/>
+              </w:rPr>
+            </w:r>
+            <w:r>
+              <w:rPr>
+                <w:b/>
+                <w:sz w:val="19"/>
+              </w:rPr>
+              <w:t>Bilgi</w:t>
+            </w:r>
+          </w:p>
+        </w:tc>
+        <w:tc>
+          <w:tcPr>
+            <w:tcW w:type="dxa" w:w="2736"/>
+            <w:shd w:val="clear" w:color="auto" w:fill="2F5496"/>
+          </w:tcPr>
+          <w:p>
+            <w:r>
+              <w:rPr>
+                <w:color w:val="FFFFFF"/>
+              </w:rPr>
+            </w:r>
+            <w:r>
+              <w:rPr>
+                <w:b/>
+                <w:sz w:val="19"/>
+              </w:rPr>
+              <w:t>Sebep</w:t>
+            </w:r>
+          </w:p>
+        </w:tc>
+        <w:tc>
+          <w:tcPr>
+            <w:tcW w:type="dxa" w:w="2736"/>
+            <w:shd w:val="clear" w:color="auto" w:fill="2F5496"/>
+          </w:tcPr>
+          <w:p>
+            <w:r>
+              <w:rPr>
+                <w:color w:val="FFFFFF"/>
+              </w:rPr>
+            </w:r>
+            <w:r>
+              <w:rPr>
+                <w:b/>
+                <w:sz w:val="19"/>
+              </w:rPr>
+              <w:t>Çözüm</w:t>
+            </w:r>
+          </w:p>
+        </w:tc>
+      </w:tr>
+      <w:tr>
+        <w:tc>
+          <w:tcPr>
+            <w:tcW w:type="dxa" w:w="1152"/>
+            <w:shd w:val="clear" w:color="auto" w:fill="D9EAD3"/>
+          </w:tcPr>
+          <w:p>
+            <w:r/>
+            <w:r>
+              <w:rPr>
+                <w:b/>
+                <w:sz w:val="18"/>
+              </w:rPr>
+              <w:t>Canlı</w:t>
+            </w:r>
+          </w:p>
+        </w:tc>
+        <w:tc>
+          <w:tcPr>
+            <w:tcW w:type="dxa" w:w="2160"/>
+          </w:tcPr>
+          <w:p>
+            <w:r/>
+            <w:r>
+              <w:rPr>
+                <w:b/>
+                <w:sz w:val="18"/>
+              </w:rPr>
+              <w:t>USGS</w:t>
+            </w:r>
+          </w:p>
+        </w:tc>
+        <w:tc>
+          <w:tcPr>
+            <w:tcW w:type="dxa" w:w="2736"/>
+          </w:tcPr>
+          <w:p>
+            <w:r/>
+            <w:r>
+              <w:rPr>
+                <w:b w:val="0"/>
+                <w:sz w:val="18"/>
+              </w:rPr>
+              <w:t>Deprem — GeoJSON API, global, 1 dk aralıkla</w:t>
+            </w:r>
+          </w:p>
+        </w:tc>
+        <w:tc>
+          <w:tcPr>
+            <w:tcW w:type="dxa" w:w="2736"/>
+          </w:tcPr>
+          <w:p>
+            <w:r/>
+            <w:r>
+              <w:rPr>
+                <w:b w:val="0"/>
+                <w:sz w:val="18"/>
+              </w:rPr>
+              <w:t>—</w:t>
+            </w:r>
+          </w:p>
+        </w:tc>
+        <w:tc>
+          <w:tcPr>
+            <w:tcW w:type="dxa" w:w="2736"/>
+          </w:tcPr>
+          <w:p>
+            <w:r/>
+            <w:r>
+              <w:rPr>
+                <w:b w:val="0"/>
+                <w:sz w:val="18"/>
+              </w:rPr>
+              <w:t>—</w:t>
+            </w:r>
+          </w:p>
+        </w:tc>
+      </w:tr>
+      <w:tr>
+        <w:tc>
+          <w:tcPr>
+            <w:tcW w:type="dxa" w:w="1152"/>
+            <w:shd w:val="clear" w:color="auto" w:fill="D9EAD3"/>
+          </w:tcPr>
+          <w:p>
+            <w:r/>
+            <w:r>
+              <w:rPr>
+                <w:b/>
+                <w:sz w:val="18"/>
+              </w:rPr>
+              <w:t>Canlı</w:t>
+            </w:r>
+          </w:p>
+        </w:tc>
+        <w:tc>
+          <w:tcPr>
+            <w:tcW w:type="dxa" w:w="2160"/>
+          </w:tcPr>
+          <w:p>
+            <w:r/>
+            <w:r>
+              <w:rPr>
+                <w:b/>
+                <w:sz w:val="18"/>
+              </w:rPr>
+              <w:t>EMSC (seismicportal.eu)</w:t>
+            </w:r>
+          </w:p>
+        </w:tc>
+        <w:tc>
+          <w:tcPr>
+            <w:tcW w:type="dxa" w:w="2736"/>
+          </w:tcPr>
+          <w:p>
+            <w:r/>
+            <w:r>
+              <w:rPr>
+                <w:b w:val="0"/>
+                <w:sz w:val="18"/>
+              </w:rPr>
+              <w:t>Deprem — WebSocket push, global, anlık</w:t>
+            </w:r>
+          </w:p>
+        </w:tc>
+        <w:tc>
+          <w:tcPr>
+            <w:tcW w:type="dxa" w:w="2736"/>
+          </w:tcPr>
+          <w:p>
+            <w:r/>
+            <w:r>
+              <w:rPr>
+                <w:b w:val="0"/>
+                <w:sz w:val="18"/>
+              </w:rPr>
+              <w:t>—</w:t>
+            </w:r>
+          </w:p>
+        </w:tc>
+        <w:tc>
+          <w:tcPr>
+            <w:tcW w:type="dxa" w:w="2736"/>
+          </w:tcPr>
+          <w:p>
+            <w:r/>
+            <w:r>
+              <w:rPr>
+                <w:b w:val="0"/>
+                <w:sz w:val="18"/>
+              </w:rPr>
+              <w:t>—</w:t>
+            </w:r>
+          </w:p>
+        </w:tc>
+      </w:tr>
+      <w:tr>
+        <w:tc>
+          <w:tcPr>
+            <w:tcW w:type="dxa" w:w="1152"/>
+            <w:shd w:val="clear" w:color="auto" w:fill="D9EAD3"/>
+          </w:tcPr>
+          <w:p>
+            <w:r/>
+            <w:r>
+              <w:rPr>
+                <w:b/>
+                <w:sz w:val="18"/>
+              </w:rPr>
+              <w:t>Canlı</w:t>
+            </w:r>
+          </w:p>
+        </w:tc>
+        <w:tc>
+          <w:tcPr>
+            <w:tcW w:type="dxa" w:w="2160"/>
+          </w:tcPr>
+          <w:p>
+            <w:r/>
+            <w:r>
+              <w:rPr>
+                <w:b/>
+                <w:sz w:val="18"/>
+              </w:rPr>
+              <w:t>GEOFON</w:t>
+            </w:r>
+          </w:p>
+        </w:tc>
+        <w:tc>
+          <w:tcPr>
+            <w:tcW w:type="dxa" w:w="2736"/>
+          </w:tcPr>
+          <w:p>
+            <w:r/>
+            <w:r>
+              <w:rPr>
+                <w:b w:val="0"/>
+                <w:sz w:val="18"/>
+              </w:rPr>
+              <w:t>Deprem — FDSN Event API, 2 dk aralık</w:t>
+            </w:r>
+          </w:p>
+        </w:tc>
+        <w:tc>
+          <w:tcPr>
+            <w:tcW w:type="dxa" w:w="2736"/>
+          </w:tcPr>
+          <w:p>
+            <w:r/>
+            <w:r>
+              <w:rPr>
+                <w:b w:val="0"/>
+                <w:sz w:val="18"/>
+              </w:rPr>
+              <w:t>—</w:t>
+            </w:r>
+          </w:p>
+        </w:tc>
+        <w:tc>
+          <w:tcPr>
+            <w:tcW w:type="dxa" w:w="2736"/>
+          </w:tcPr>
+          <w:p>
+            <w:r/>
+            <w:r>
+              <w:rPr>
+                <w:b w:val="0"/>
+                <w:sz w:val="18"/>
+              </w:rPr>
+              <w:t>—</w:t>
+            </w:r>
+          </w:p>
+        </w:tc>
+      </w:tr>
+      <w:tr>
+        <w:tc>
+          <w:tcPr>
+            <w:tcW w:type="dxa" w:w="1152"/>
+            <w:shd w:val="clear" w:color="auto" w:fill="D9EAD3"/>
+          </w:tcPr>
+          <w:p>
+            <w:r/>
+            <w:r>
+              <w:rPr>
+                <w:b/>
+                <w:sz w:val="18"/>
+              </w:rPr>
+              <w:t>Canlı</w:t>
+            </w:r>
+          </w:p>
+        </w:tc>
+        <w:tc>
+          <w:tcPr>
+            <w:tcW w:type="dxa" w:w="2160"/>
+          </w:tcPr>
+          <w:p>
+            <w:r/>
+            <w:r>
+              <w:rPr>
+                <w:b/>
+                <w:sz w:val="18"/>
+              </w:rPr>
+              <w:t>AFAD</w:t>
+            </w:r>
+          </w:p>
+        </w:tc>
+        <w:tc>
+          <w:tcPr>
+            <w:tcW w:type="dxa" w:w="2736"/>
+          </w:tcPr>
+          <w:p>
+            <w:r/>
+            <w:r>
+              <w:rPr>
+                <w:b w:val="0"/>
+                <w:sz w:val="18"/>
+              </w:rPr>
+              <w:t>Deprem — JSON API, sadece Türkiye</w:t>
+            </w:r>
+          </w:p>
+        </w:tc>
+        <w:tc>
+          <w:tcPr>
+            <w:tcW w:type="dxa" w:w="2736"/>
+          </w:tcPr>
+          <w:p>
+            <w:r/>
+            <w:r>
+              <w:rPr>
+                <w:b w:val="0"/>
+                <w:sz w:val="18"/>
+              </w:rPr>
+              <w:t>—</w:t>
+            </w:r>
+          </w:p>
+        </w:tc>
+        <w:tc>
+          <w:tcPr>
+            <w:tcW w:type="dxa" w:w="2736"/>
+          </w:tcPr>
+          <w:p>
+            <w:r/>
+            <w:r>
+              <w:rPr>
+                <w:b w:val="0"/>
+                <w:sz w:val="18"/>
+              </w:rPr>
+              <w:t>—</w:t>
+            </w:r>
+          </w:p>
+        </w:tc>
+      </w:tr>
+      <w:tr>
+        <w:tc>
+          <w:tcPr>
+            <w:tcW w:type="dxa" w:w="1152"/>
+            <w:shd w:val="clear" w:color="auto" w:fill="D9EAD3"/>
+          </w:tcPr>
+          <w:p>
+            <w:r/>
+            <w:r>
+              <w:rPr>
+                <w:b/>
+                <w:sz w:val="18"/>
+              </w:rPr>
+              <w:t>Canlı</w:t>
+            </w:r>
+          </w:p>
+        </w:tc>
+        <w:tc>
+          <w:tcPr>
+            <w:tcW w:type="dxa" w:w="2160"/>
+          </w:tcPr>
+          <w:p>
+            <w:r/>
+            <w:r>
+              <w:rPr>
+                <w:b/>
+                <w:sz w:val="18"/>
+              </w:rPr>
+              <w:t>Kandilli (proxy)</w:t>
+            </w:r>
+          </w:p>
+        </w:tc>
+        <w:tc>
+          <w:tcPr>
+            <w:tcW w:type="dxa" w:w="2736"/>
+          </w:tcPr>
+          <w:p>
+            <w:r/>
+            <w:r>
+              <w:rPr>
+                <w:b w:val="0"/>
+                <w:sz w:val="18"/>
+              </w:rPr>
+              <w:t>Deprem — JSON API, sadece Türkiye</w:t>
+            </w:r>
+          </w:p>
+        </w:tc>
+        <w:tc>
+          <w:tcPr>
+            <w:tcW w:type="dxa" w:w="2736"/>
+          </w:tcPr>
+          <w:p>
+            <w:r/>
+            <w:r>
+              <w:rPr>
+                <w:b w:val="0"/>
+                <w:sz w:val="18"/>
+              </w:rPr>
+              <w:t>—</w:t>
+            </w:r>
+          </w:p>
+        </w:tc>
+        <w:tc>
+          <w:tcPr>
+            <w:tcW w:type="dxa" w:w="2736"/>
+          </w:tcPr>
+          <w:p>
+            <w:r/>
+            <w:r>
+              <w:rPr>
+                <w:b w:val="0"/>
+                <w:sz w:val="18"/>
+              </w:rPr>
+              <w:t>—</w:t>
+            </w:r>
+          </w:p>
+        </w:tc>
+      </w:tr>
+      <w:tr>
+        <w:tc>
+          <w:tcPr>
+            <w:tcW w:type="dxa" w:w="1152"/>
+            <w:shd w:val="clear" w:color="auto" w:fill="D9EAD3"/>
+          </w:tcPr>
+          <w:p>
+            <w:r/>
+            <w:r>
+              <w:rPr>
+                <w:b/>
+                <w:sz w:val="18"/>
+              </w:rPr>
+              <w:t>Canlı</w:t>
+            </w:r>
+          </w:p>
+        </w:tc>
+        <w:tc>
+          <w:tcPr>
+            <w:tcW w:type="dxa" w:w="2160"/>
+          </w:tcPr>
+          <w:p>
+            <w:r/>
+            <w:r>
+              <w:rPr>
+                <w:b/>
+                <w:sz w:val="18"/>
+              </w:rPr>
+              <w:t>GloFAS / Copernicus</w:t>
+            </w:r>
+          </w:p>
+        </w:tc>
+        <w:tc>
+          <w:tcPr>
+            <w:tcW w:type="dxa" w:w="2736"/>
+          </w:tcPr>
+          <w:p>
+            <w:r/>
+            <w:r>
+              <w:rPr>
+                <w:b w:val="0"/>
+                <w:sz w:val="18"/>
+              </w:rPr>
+              <w:t>Sel — JSON API, global</w:t>
+            </w:r>
+          </w:p>
+        </w:tc>
+        <w:tc>
+          <w:tcPr>
+            <w:tcW w:type="dxa" w:w="2736"/>
+          </w:tcPr>
+          <w:p>
+            <w:r/>
+            <w:r>
+              <w:rPr>
+                <w:b w:val="0"/>
+                <w:sz w:val="18"/>
+              </w:rPr>
+              <w:t>—</w:t>
+            </w:r>
+          </w:p>
+        </w:tc>
+        <w:tc>
+          <w:tcPr>
+            <w:tcW w:type="dxa" w:w="2736"/>
+          </w:tcPr>
+          <w:p>
+            <w:r/>
+            <w:r>
+              <w:rPr>
+                <w:b w:val="0"/>
+                <w:sz w:val="18"/>
+              </w:rPr>
+              <w:t>—</w:t>
+            </w:r>
+          </w:p>
+        </w:tc>
+      </w:tr>
+      <w:tr>
+        <w:tc>
+          <w:tcPr>
+            <w:tcW w:type="dxa" w:w="1152"/>
+            <w:shd w:val="clear" w:color="auto" w:fill="D9EAD3"/>
+          </w:tcPr>
+          <w:p>
+            <w:r/>
+            <w:r>
+              <w:rPr>
+                <w:b/>
+                <w:sz w:val="18"/>
+              </w:rPr>
+              <w:t>Canlı</w:t>
+            </w:r>
+          </w:p>
+        </w:tc>
+        <w:tc>
+          <w:tcPr>
+            <w:tcW w:type="dxa" w:w="2160"/>
+          </w:tcPr>
+          <w:p>
+            <w:r/>
+            <w:r>
+              <w:rPr>
+                <w:b/>
+                <w:sz w:val="18"/>
+              </w:rPr>
+              <w:t>ReliefWeb</w:t>
+            </w:r>
+          </w:p>
+        </w:tc>
+        <w:tc>
+          <w:tcPr>
+            <w:tcW w:type="dxa" w:w="2736"/>
+          </w:tcPr>
+          <w:p>
+            <w:r/>
+            <w:r>
+              <w:rPr>
+                <w:b w:val="0"/>
+                <w:sz w:val="18"/>
+              </w:rPr>
+              <w:t>Sel + Gıda Güvenliği — JSON API (filtreli), global</w:t>
+            </w:r>
+          </w:p>
+        </w:tc>
+        <w:tc>
+          <w:tcPr>
+            <w:tcW w:type="dxa" w:w="2736"/>
+          </w:tcPr>
+          <w:p>
+            <w:r/>
+            <w:r>
+              <w:rPr>
+                <w:b w:val="0"/>
+                <w:sz w:val="18"/>
+              </w:rPr>
+              <w:t>—</w:t>
+            </w:r>
+          </w:p>
+        </w:tc>
+        <w:tc>
+          <w:tcPr>
+            <w:tcW w:type="dxa" w:w="2736"/>
+          </w:tcPr>
+          <w:p>
+            <w:r/>
+            <w:r>
+              <w:rPr>
+                <w:b w:val="0"/>
+                <w:sz w:val="18"/>
+              </w:rPr>
+              <w:t>—</w:t>
+            </w:r>
+          </w:p>
+        </w:tc>
+      </w:tr>
+      <w:tr>
+        <w:tc>
+          <w:tcPr>
+            <w:tcW w:type="dxa" w:w="1152"/>
+            <w:shd w:val="clear" w:color="auto" w:fill="D9EAD3"/>
+          </w:tcPr>
+          <w:p>
+            <w:r/>
+            <w:r>
+              <w:rPr>
+                <w:b/>
+                <w:sz w:val="18"/>
+              </w:rPr>
+              <w:t>Canlı</w:t>
+            </w:r>
+          </w:p>
+        </w:tc>
+        <w:tc>
+          <w:tcPr>
+            <w:tcW w:type="dxa" w:w="2160"/>
+          </w:tcPr>
+          <w:p>
+            <w:r/>
+            <w:r>
+              <w:rPr>
+                <w:b/>
+                <w:sz w:val="18"/>
+              </w:rPr>
+              <w:t>NASA FIRMS (VIIRS)</w:t>
+            </w:r>
+          </w:p>
+        </w:tc>
+        <w:tc>
+          <w:tcPr>
+            <w:tcW w:type="dxa" w:w="2736"/>
+          </w:tcPr>
+          <w:p>
+            <w:r/>
+            <w:r>
+              <w:rPr>
+                <w:b w:val="0"/>
+                <w:sz w:val="18"/>
+              </w:rPr>
+              <w:t>Orman Yangını — JSON/CSV API, 15 dk aralık</w:t>
+            </w:r>
+          </w:p>
+        </w:tc>
+        <w:tc>
+          <w:tcPr>
+            <w:tcW w:type="dxa" w:w="2736"/>
+          </w:tcPr>
+          <w:p>
+            <w:r/>
+            <w:r>
+              <w:rPr>
+                <w:b w:val="0"/>
+                <w:sz w:val="18"/>
+              </w:rPr>
+              <w:t>—</w:t>
+            </w:r>
+          </w:p>
+        </w:tc>
+        <w:tc>
+          <w:tcPr>
+            <w:tcW w:type="dxa" w:w="2736"/>
+          </w:tcPr>
+          <w:p>
+            <w:r/>
+            <w:r>
+              <w:rPr>
+                <w:b w:val="0"/>
+                <w:sz w:val="18"/>
+              </w:rPr>
+              <w:t>—</w:t>
+            </w:r>
+          </w:p>
+        </w:tc>
+      </w:tr>
+      <w:tr>
+        <w:tc>
+          <w:tcPr>
+            <w:tcW w:type="dxa" w:w="1152"/>
+            <w:shd w:val="clear" w:color="auto" w:fill="D9EAD3"/>
+          </w:tcPr>
+          <w:p>
+            <w:r/>
+            <w:r>
+              <w:rPr>
+                <w:b/>
+                <w:sz w:val="18"/>
+              </w:rPr>
+              <w:t>Canlı</w:t>
+            </w:r>
+          </w:p>
+        </w:tc>
+        <w:tc>
+          <w:tcPr>
+            <w:tcW w:type="dxa" w:w="2160"/>
+          </w:tcPr>
+          <w:p>
+            <w:r/>
+            <w:r>
+              <w:rPr>
+                <w:b/>
+                <w:sz w:val="18"/>
+              </w:rPr>
+              <w:t>FEWS NET</w:t>
+            </w:r>
+          </w:p>
+        </w:tc>
+        <w:tc>
+          <w:tcPr>
+            <w:tcW w:type="dxa" w:w="2736"/>
+          </w:tcPr>
+          <w:p>
+            <w:r/>
+            <w:r>
+              <w:rPr>
+                <w:b w:val="0"/>
+                <w:sz w:val="18"/>
+              </w:rPr>
+              <w:t>Kuraklık — JSON API, global (FEWS ülkeleri)</w:t>
+            </w:r>
+          </w:p>
+        </w:tc>
+        <w:tc>
+          <w:tcPr>
+            <w:tcW w:type="dxa" w:w="2736"/>
+          </w:tcPr>
+          <w:p>
+            <w:r/>
+            <w:r>
+              <w:rPr>
+                <w:b w:val="0"/>
+                <w:sz w:val="18"/>
+              </w:rPr>
+              <w:t>—</w:t>
+            </w:r>
+          </w:p>
+        </w:tc>
+        <w:tc>
+          <w:tcPr>
+            <w:tcW w:type="dxa" w:w="2736"/>
+          </w:tcPr>
+          <w:p>
+            <w:r/>
+            <w:r>
+              <w:rPr>
+                <w:b w:val="0"/>
+                <w:sz w:val="18"/>
+              </w:rPr>
+              <w:t>—</w:t>
+            </w:r>
+          </w:p>
+        </w:tc>
+      </w:tr>
+      <w:tr>
+        <w:tc>
+          <w:tcPr>
+            <w:tcW w:type="dxa" w:w="1152"/>
+            <w:shd w:val="clear" w:color="auto" w:fill="D9EAD3"/>
+          </w:tcPr>
+          <w:p>
+            <w:r/>
+            <w:r>
+              <w:rPr>
+                <w:b/>
+                <w:sz w:val="18"/>
+              </w:rPr>
+              <w:t>Canlı</w:t>
+            </w:r>
+          </w:p>
+        </w:tc>
+        <w:tc>
+          <w:tcPr>
+            <w:tcW w:type="dxa" w:w="2160"/>
+          </w:tcPr>
+          <w:p>
+            <w:r/>
+            <w:r>
+              <w:rPr>
+                <w:b/>
+                <w:sz w:val="18"/>
+              </w:rPr>
+              <w:t>WFP VAM</w:t>
+            </w:r>
+          </w:p>
+        </w:tc>
+        <w:tc>
+          <w:tcPr>
+            <w:tcW w:type="dxa" w:w="2736"/>
+          </w:tcPr>
+          <w:p>
+            <w:r/>
+            <w:r>
+              <w:rPr>
+                <w:b w:val="0"/>
+                <w:sz w:val="18"/>
+              </w:rPr>
+              <w:t>Kuraklık — GeoJSON endpoint, global</w:t>
+            </w:r>
+          </w:p>
+        </w:tc>
+        <w:tc>
+          <w:tcPr>
+            <w:tcW w:type="dxa" w:w="2736"/>
+          </w:tcPr>
+          <w:p>
+            <w:r/>
+            <w:r>
+              <w:rPr>
+                <w:b w:val="0"/>
+                <w:sz w:val="18"/>
+              </w:rPr>
+              <w:t>—</w:t>
+            </w:r>
+          </w:p>
+        </w:tc>
+        <w:tc>
+          <w:tcPr>
+            <w:tcW w:type="dxa" w:w="2736"/>
+          </w:tcPr>
+          <w:p>
+            <w:r/>
+            <w:r>
+              <w:rPr>
+                <w:b w:val="0"/>
+                <w:sz w:val="18"/>
+              </w:rPr>
+              <w:t>—</w:t>
+            </w:r>
+          </w:p>
+        </w:tc>
+      </w:tr>
+      <w:tr>
+        <w:tc>
+          <w:tcPr>
+            <w:tcW w:type="dxa" w:w="1152"/>
+            <w:shd w:val="clear" w:color="auto" w:fill="D9EAD3"/>
+          </w:tcPr>
+          <w:p>
+            <w:r/>
+            <w:r>
+              <w:rPr>
+                <w:b/>
+                <w:sz w:val="18"/>
+              </w:rPr>
+              <w:t>Canlı</w:t>
+            </w:r>
+          </w:p>
+        </w:tc>
+        <w:tc>
+          <w:tcPr>
+            <w:tcW w:type="dxa" w:w="2160"/>
+          </w:tcPr>
+          <w:p>
+            <w:r/>
+            <w:r>
+              <w:rPr>
+                <w:b/>
+                <w:sz w:val="18"/>
+              </w:rPr>
+              <w:t>WFP HungerMap</w:t>
+            </w:r>
+          </w:p>
+        </w:tc>
+        <w:tc>
+          <w:tcPr>
+            <w:tcW w:type="dxa" w:w="2736"/>
+          </w:tcPr>
+          <w:p>
+            <w:r/>
+            <w:r>
+              <w:rPr>
+                <w:b w:val="0"/>
+                <w:sz w:val="18"/>
+              </w:rPr>
+              <w:t>Gıda Güvenliği — JSON API, global</w:t>
+            </w:r>
+          </w:p>
+        </w:tc>
+        <w:tc>
+          <w:tcPr>
+            <w:tcW w:type="dxa" w:w="2736"/>
+          </w:tcPr>
+          <w:p>
+            <w:r/>
+            <w:r>
+              <w:rPr>
+                <w:b w:val="0"/>
+                <w:sz w:val="18"/>
+              </w:rPr>
+              <w:t>—</w:t>
+            </w:r>
+          </w:p>
+        </w:tc>
+        <w:tc>
+          <w:tcPr>
+            <w:tcW w:type="dxa" w:w="2736"/>
+          </w:tcPr>
+          <w:p>
+            <w:r/>
+            <w:r>
+              <w:rPr>
+                <w:b w:val="0"/>
+                <w:sz w:val="18"/>
+              </w:rPr>
+              <w:t>—</w:t>
+            </w:r>
+          </w:p>
+        </w:tc>
+      </w:tr>
+      <w:tr>
+        <w:tc>
+          <w:tcPr>
+            <w:tcW w:type="dxa" w:w="1152"/>
+            <w:shd w:val="clear" w:color="auto" w:fill="D9EAD3"/>
+          </w:tcPr>
+          <w:p>
+            <w:r/>
+            <w:r>
+              <w:rPr>
+                <w:b/>
+                <w:sz w:val="18"/>
+              </w:rPr>
+              <w:t>Canlı</w:t>
+            </w:r>
+          </w:p>
+        </w:tc>
+        <w:tc>
+          <w:tcPr>
+            <w:tcW w:type="dxa" w:w="2160"/>
+          </w:tcPr>
+          <w:p>
+            <w:r/>
+            <w:r>
+              <w:rPr>
+                <w:b/>
+                <w:sz w:val="18"/>
+              </w:rPr>
+              <w:t>GDACS (REST + RSS)</w:t>
+            </w:r>
+          </w:p>
+        </w:tc>
+        <w:tc>
+          <w:tcPr>
+            <w:tcW w:type="dxa" w:w="2736"/>
+          </w:tcPr>
+          <w:p>
+            <w:r/>
+            <w:r>
+              <w:rPr>
+                <w:b w:val="0"/>
+                <w:sz w:val="18"/>
+              </w:rPr>
+              <w:t>Çoklu hazard (deprem/sel/kuraklık/yangın) — tek endpoint'ten 4 tipe bölünüyor</w:t>
+            </w:r>
+          </w:p>
+        </w:tc>
+        <w:tc>
+          <w:tcPr>
+            <w:tcW w:type="dxa" w:w="2736"/>
+          </w:tcPr>
+          <w:p>
+            <w:r/>
+            <w:r>
+              <w:rPr>
+                <w:b w:val="0"/>
+                <w:sz w:val="18"/>
+              </w:rPr>
+              <w:t>—</w:t>
+            </w:r>
+          </w:p>
+        </w:tc>
+        <w:tc>
+          <w:tcPr>
+            <w:tcW w:type="dxa" w:w="2736"/>
+          </w:tcPr>
+          <w:p>
+            <w:r/>
+            <w:r>
+              <w:rPr>
+                <w:b w:val="0"/>
+                <w:sz w:val="18"/>
+              </w:rPr>
+              <w:t>—</w:t>
+            </w:r>
+          </w:p>
+        </w:tc>
+      </w:tr>
+      <w:tr>
+        <w:tc>
+          <w:tcPr>
+            <w:tcW w:type="dxa" w:w="1152"/>
+            <w:shd w:val="clear" w:color="auto" w:fill="D9EAD3"/>
+          </w:tcPr>
+          <w:p>
+            <w:r/>
+            <w:r>
+              <w:rPr>
+                <w:b/>
+                <w:sz w:val="18"/>
+              </w:rPr>
+              <w:t>Canlı</w:t>
+            </w:r>
+          </w:p>
+        </w:tc>
+        <w:tc>
+          <w:tcPr>
+            <w:tcW w:type="dxa" w:w="2160"/>
+          </w:tcPr>
+          <w:p>
+            <w:r/>
+            <w:r>
+              <w:rPr>
+                <w:b/>
+                <w:sz w:val="18"/>
+              </w:rPr>
+              <w:t>PTWC</w:t>
+            </w:r>
+          </w:p>
+        </w:tc>
+        <w:tc>
+          <w:tcPr>
+            <w:tcW w:type="dxa" w:w="2736"/>
+          </w:tcPr>
+          <w:p>
+            <w:r/>
+            <w:r>
+              <w:rPr>
+                <w:b w:val="0"/>
+                <w:sz w:val="18"/>
+              </w:rPr>
+              <w:t>Tsunami — REST bülten akışı, 3 dk'da bir cron</w:t>
+            </w:r>
+          </w:p>
+        </w:tc>
+        <w:tc>
+          <w:tcPr>
+            <w:tcW w:type="dxa" w:w="2736"/>
+          </w:tcPr>
+          <w:p>
+            <w:r/>
+            <w:r>
+              <w:rPr>
+                <w:b w:val="0"/>
+                <w:sz w:val="18"/>
+              </w:rPr>
+              <w:t>—</w:t>
+            </w:r>
+          </w:p>
+        </w:tc>
+        <w:tc>
+          <w:tcPr>
+            <w:tcW w:type="dxa" w:w="2736"/>
+          </w:tcPr>
+          <w:p>
+            <w:r/>
+            <w:r>
+              <w:rPr>
+                <w:b w:val="0"/>
+                <w:sz w:val="18"/>
+              </w:rPr>
+              <w:t>—</w:t>
+            </w:r>
+          </w:p>
+        </w:tc>
+      </w:tr>
+      <w:tr>
+        <w:tc>
+          <w:tcPr>
+            <w:tcW w:type="dxa" w:w="1152"/>
+            <w:shd w:val="clear" w:color="auto" w:fill="D9EAD3"/>
+          </w:tcPr>
+          <w:p>
+            <w:r/>
+            <w:r>
+              <w:rPr>
+                <w:b/>
+                <w:sz w:val="18"/>
+              </w:rPr>
+              <w:t>Canlı</w:t>
+            </w:r>
+          </w:p>
+        </w:tc>
+        <w:tc>
+          <w:tcPr>
+            <w:tcW w:type="dxa" w:w="2160"/>
+          </w:tcPr>
+          <w:p>
+            <w:r/>
+            <w:r>
+              <w:rPr>
+                <w:b/>
+                <w:sz w:val="18"/>
+              </w:rPr>
+              <w:t>WHO</w:t>
+            </w:r>
+          </w:p>
+        </w:tc>
+        <w:tc>
+          <w:tcPr>
+            <w:tcW w:type="dxa" w:w="2736"/>
+          </w:tcPr>
+          <w:p>
+            <w:r/>
+            <w:r>
+              <w:rPr>
+                <w:b w:val="0"/>
+                <w:sz w:val="18"/>
+              </w:rPr>
+              <w:t>Salgın — hastalık salgını API'si, 30 dk'da bir cron</w:t>
+            </w:r>
+          </w:p>
+        </w:tc>
+        <w:tc>
+          <w:tcPr>
+            <w:tcW w:type="dxa" w:w="2736"/>
+          </w:tcPr>
+          <w:p>
+            <w:r/>
+            <w:r>
+              <w:rPr>
+                <w:b w:val="0"/>
+                <w:sz w:val="18"/>
+              </w:rPr>
+              <w:t>—</w:t>
+            </w:r>
+          </w:p>
+        </w:tc>
+        <w:tc>
+          <w:tcPr>
+            <w:tcW w:type="dxa" w:w="2736"/>
+          </w:tcPr>
+          <w:p>
+            <w:r/>
+            <w:r>
+              <w:rPr>
+                <w:b w:val="0"/>
+                <w:sz w:val="18"/>
+              </w:rPr>
+              <w:t>—</w:t>
+            </w:r>
+          </w:p>
+        </w:tc>
+      </w:tr>
+      <w:tr>
+        <w:tc>
+          <w:tcPr>
+            <w:tcW w:type="dxa" w:w="1152"/>
+            <w:shd w:val="clear" w:color="auto" w:fill="D9EAD3"/>
+          </w:tcPr>
+          <w:p>
+            <w:r/>
+            <w:r>
+              <w:rPr>
+                <w:b/>
+                <w:sz w:val="18"/>
+              </w:rPr>
+              <w:t>Canlı</w:t>
+            </w:r>
+          </w:p>
+        </w:tc>
+        <w:tc>
+          <w:tcPr>
+            <w:tcW w:type="dxa" w:w="2160"/>
+          </w:tcPr>
+          <w:p>
+            <w:r/>
+            <w:r>
+              <w:rPr>
+                <w:b/>
+                <w:sz w:val="18"/>
+              </w:rPr>
+              <w:t>Kontur Population</w:t>
+            </w:r>
+          </w:p>
+        </w:tc>
+        <w:tc>
+          <w:tcPr>
+            <w:tcW w:type="dxa" w:w="2736"/>
+          </w:tcPr>
+          <w:p>
+            <w:r/>
+            <w:r>
+              <w:rPr>
+                <w:b w:val="0"/>
+                <w:sz w:val="18"/>
+              </w:rPr>
+              <w:t>Nüfus — HDX GeoPackage, H3 altıgen, haftalık cron</w:t>
+            </w:r>
+          </w:p>
+        </w:tc>
+        <w:tc>
+          <w:tcPr>
+            <w:tcW w:type="dxa" w:w="2736"/>
+          </w:tcPr>
+          <w:p>
+            <w:r/>
+            <w:r>
+              <w:rPr>
+                <w:b w:val="0"/>
+                <w:sz w:val="18"/>
+              </w:rPr>
+              <w:t>—</w:t>
+            </w:r>
+          </w:p>
+        </w:tc>
+        <w:tc>
+          <w:tcPr>
+            <w:tcW w:type="dxa" w:w="2736"/>
+          </w:tcPr>
+          <w:p>
+            <w:r/>
+            <w:r>
+              <w:rPr>
+                <w:b w:val="0"/>
+                <w:sz w:val="18"/>
+              </w:rPr>
+              <w:t>—</w:t>
+            </w:r>
+          </w:p>
+        </w:tc>
+      </w:tr>
+      <w:tr>
+        <w:tc>
+          <w:tcPr>
+            <w:tcW w:type="dxa" w:w="1152"/>
+            <w:shd w:val="clear" w:color="auto" w:fill="D9EAD3"/>
+          </w:tcPr>
+          <w:p>
+            <w:r/>
+            <w:r>
+              <w:rPr>
+                <w:b/>
+                <w:sz w:val="18"/>
+              </w:rPr>
+              <w:t>Canlı</w:t>
+            </w:r>
+          </w:p>
+        </w:tc>
+        <w:tc>
+          <w:tcPr>
+            <w:tcW w:type="dxa" w:w="2160"/>
+          </w:tcPr>
+          <w:p>
+            <w:r/>
+            <w:r>
+              <w:rPr>
+                <w:b/>
+                <w:sz w:val="18"/>
+              </w:rPr>
+              <w:t>WorldPop</w:t>
+            </w:r>
+          </w:p>
+        </w:tc>
+        <w:tc>
+          <w:tcPr>
+            <w:tcW w:type="dxa" w:w="2736"/>
+          </w:tcPr>
+          <w:p>
+            <w:r/>
+            <w:r>
+              <w:rPr>
+                <w:b w:val="0"/>
+                <w:sz w:val="18"/>
+              </w:rPr>
+              <w:t>Nüfus — ülke bazlı GeoTIFF REST API, raster→altıgen pipeline</w:t>
+            </w:r>
+          </w:p>
+        </w:tc>
+        <w:tc>
+          <w:tcPr>
+            <w:tcW w:type="dxa" w:w="2736"/>
+          </w:tcPr>
+          <w:p>
+            <w:r/>
+            <w:r>
+              <w:rPr>
+                <w:b w:val="0"/>
+                <w:sz w:val="18"/>
+              </w:rPr>
+              <w:t>—</w:t>
+            </w:r>
+          </w:p>
+        </w:tc>
+        <w:tc>
+          <w:tcPr>
+            <w:tcW w:type="dxa" w:w="2736"/>
+          </w:tcPr>
+          <w:p>
+            <w:r/>
+            <w:r>
+              <w:rPr>
+                <w:b w:val="0"/>
+                <w:sz w:val="18"/>
+              </w:rPr>
+              <w:t>—</w:t>
+            </w:r>
+          </w:p>
+        </w:tc>
+      </w:tr>
+      <w:tr>
+        <w:tc>
+          <w:tcPr>
+            <w:tcW w:type="dxa" w:w="1152"/>
+            <w:shd w:val="clear" w:color="auto" w:fill="D9EAD3"/>
+          </w:tcPr>
+          <w:p>
+            <w:r/>
+            <w:r>
+              <w:rPr>
+                <w:b/>
+                <w:sz w:val="18"/>
+              </w:rPr>
+              <w:t>Canlı</w:t>
+            </w:r>
+          </w:p>
+        </w:tc>
+        <w:tc>
+          <w:tcPr>
+            <w:tcW w:type="dxa" w:w="2160"/>
+          </w:tcPr>
+          <w:p>
+            <w:r/>
+            <w:r>
+              <w:rPr>
+                <w:b/>
+                <w:sz w:val="18"/>
+              </w:rPr>
+              <w:t>OSM/Overpass Roads</w:t>
+            </w:r>
+          </w:p>
+        </w:tc>
+        <w:tc>
+          <w:tcPr>
+            <w:tcW w:type="dxa" w:w="2736"/>
+          </w:tcPr>
+          <w:p>
+            <w:r/>
+            <w:r>
+              <w:rPr>
+                <w:b w:val="0"/>
+                <w:sz w:val="18"/>
+              </w:rPr>
+              <w:t>Yol ağı — motorway/trunk/primary, periyodik import</w:t>
+            </w:r>
+          </w:p>
+        </w:tc>
+        <w:tc>
+          <w:tcPr>
+            <w:tcW w:type="dxa" w:w="2736"/>
+          </w:tcPr>
+          <w:p>
+            <w:r/>
+            <w:r>
+              <w:rPr>
+                <w:b w:val="0"/>
+                <w:sz w:val="18"/>
+              </w:rPr>
+              <w:t>—</w:t>
+            </w:r>
+          </w:p>
+        </w:tc>
+        <w:tc>
+          <w:tcPr>
+            <w:tcW w:type="dxa" w:w="2736"/>
+          </w:tcPr>
+          <w:p>
+            <w:r/>
+            <w:r>
+              <w:rPr>
+                <w:b w:val="0"/>
+                <w:sz w:val="18"/>
+              </w:rPr>
+              <w:t>—</w:t>
+            </w:r>
+          </w:p>
+        </w:tc>
+      </w:tr>
+      <w:tr>
+        <w:tc>
+          <w:tcPr>
+            <w:tcW w:type="dxa" w:w="1152"/>
+            <w:shd w:val="clear" w:color="auto" w:fill="D9EAD3"/>
+          </w:tcPr>
+          <w:p>
+            <w:r/>
+            <w:r>
+              <w:rPr>
+                <w:b/>
+                <w:sz w:val="18"/>
+              </w:rPr>
+              <w:t>Canlı</w:t>
+            </w:r>
+          </w:p>
+        </w:tc>
+        <w:tc>
+          <w:tcPr>
+            <w:tcW w:type="dxa" w:w="2160"/>
+          </w:tcPr>
+          <w:p>
+            <w:r/>
+            <w:r>
+              <w:rPr>
+                <w:b/>
+                <w:sz w:val="18"/>
+              </w:rPr>
+              <w:t>HydroRIVERS</w:t>
+            </w:r>
+          </w:p>
+        </w:tc>
+        <w:tc>
+          <w:tcPr>
+            <w:tcW w:type="dxa" w:w="2736"/>
+          </w:tcPr>
+          <w:p>
+            <w:r/>
+            <w:r>
+              <w:rPr>
+                <w:b w:val="0"/>
+                <w:sz w:val="18"/>
+              </w:rPr>
+              <w:t>Nehir ağı — HydroSHEDS ailesi, ülke sınırına kırpılı</w:t>
+            </w:r>
+          </w:p>
+        </w:tc>
+        <w:tc>
+          <w:tcPr>
+            <w:tcW w:type="dxa" w:w="2736"/>
+          </w:tcPr>
+          <w:p>
+            <w:r/>
+            <w:r>
+              <w:rPr>
+                <w:b w:val="0"/>
+                <w:sz w:val="18"/>
+              </w:rPr>
+              <w:t>—</w:t>
+            </w:r>
+          </w:p>
+        </w:tc>
+        <w:tc>
+          <w:tcPr>
+            <w:tcW w:type="dxa" w:w="2736"/>
+          </w:tcPr>
+          <w:p>
+            <w:r/>
+            <w:r>
+              <w:rPr>
+                <w:b w:val="0"/>
+                <w:sz w:val="18"/>
+              </w:rPr>
+              <w:t>—</w:t>
+            </w:r>
+          </w:p>
+        </w:tc>
+      </w:tr>
+      <w:tr>
+        <w:tc>
+          <w:tcPr>
+            <w:tcW w:type="dxa" w:w="1152"/>
+            <w:shd w:val="clear" w:color="auto" w:fill="D9EAD3"/>
+          </w:tcPr>
+          <w:p>
+            <w:r/>
+            <w:r>
+              <w:rPr>
+                <w:b/>
+                <w:sz w:val="18"/>
+              </w:rPr>
+              <w:t>Canlı</w:t>
+            </w:r>
+          </w:p>
+        </w:tc>
+        <w:tc>
+          <w:tcPr>
+            <w:tcW w:type="dxa" w:w="2160"/>
+          </w:tcPr>
+          <w:p>
+            <w:r/>
+            <w:r>
+              <w:rPr>
+                <w:b/>
+                <w:sz w:val="18"/>
+              </w:rPr>
+              <w:t>HydroBASINS</w:t>
+            </w:r>
+          </w:p>
+        </w:tc>
+        <w:tc>
+          <w:tcPr>
+            <w:tcW w:type="dxa" w:w="2736"/>
+          </w:tcPr>
+          <w:p>
+            <w:r/>
+            <w:r>
+              <w:rPr>
+                <w:b w:val="0"/>
+                <w:sz w:val="18"/>
+              </w:rPr>
+              <w:t>Havza sınırları (seviye 6) — HydroSHEDS ailesi</w:t>
+            </w:r>
+          </w:p>
+        </w:tc>
+        <w:tc>
+          <w:tcPr>
+            <w:tcW w:type="dxa" w:w="2736"/>
+          </w:tcPr>
+          <w:p>
+            <w:r/>
+            <w:r>
+              <w:rPr>
+                <w:b w:val="0"/>
+                <w:sz w:val="18"/>
+              </w:rPr>
+              <w:t>—</w:t>
+            </w:r>
+          </w:p>
+        </w:tc>
+        <w:tc>
+          <w:tcPr>
+            <w:tcW w:type="dxa" w:w="2736"/>
+          </w:tcPr>
+          <w:p>
+            <w:r/>
+            <w:r>
+              <w:rPr>
+                <w:b w:val="0"/>
+                <w:sz w:val="18"/>
+              </w:rPr>
+              <w:t>—</w:t>
+            </w:r>
+          </w:p>
+        </w:tc>
+      </w:tr>
+      <w:tr>
+        <w:tc>
+          <w:tcPr>
+            <w:tcW w:type="dxa" w:w="1152"/>
+            <w:shd w:val="clear" w:color="auto" w:fill="D9EAD3"/>
+          </w:tcPr>
+          <w:p>
+            <w:r/>
+            <w:r>
+              <w:rPr>
+                <w:b/>
+                <w:sz w:val="18"/>
+              </w:rPr>
+              <w:t>Canlı</w:t>
+            </w:r>
+          </w:p>
+        </w:tc>
+        <w:tc>
+          <w:tcPr>
+            <w:tcW w:type="dxa" w:w="2160"/>
+          </w:tcPr>
+          <w:p>
+            <w:r/>
+            <w:r>
+              <w:rPr>
+                <w:b/>
+                <w:sz w:val="18"/>
+              </w:rPr>
+              <w:t>OSM/Overpass Buildings</w:t>
+            </w:r>
+          </w:p>
+        </w:tc>
+        <w:tc>
+          <w:tcPr>
+            <w:tcW w:type="dxa" w:w="2736"/>
+          </w:tcPr>
+          <w:p>
+            <w:r/>
+            <w:r>
+              <w:rPr>
+                <w:b w:val="0"/>
+                <w:sz w:val="18"/>
+              </w:rPr>
+              <w:t>Kritik tesisler (hastane/okul/itfaiye vb.) — haftalık cron</w:t>
+            </w:r>
+          </w:p>
+        </w:tc>
+        <w:tc>
+          <w:tcPr>
+            <w:tcW w:type="dxa" w:w="2736"/>
+          </w:tcPr>
+          <w:p>
+            <w:r/>
+            <w:r>
+              <w:rPr>
+                <w:b w:val="0"/>
+                <w:sz w:val="18"/>
+              </w:rPr>
+              <w:t>—</w:t>
+            </w:r>
+          </w:p>
+        </w:tc>
+        <w:tc>
+          <w:tcPr>
+            <w:tcW w:type="dxa" w:w="2736"/>
+          </w:tcPr>
+          <w:p>
+            <w:r/>
+            <w:r>
+              <w:rPr>
+                <w:b w:val="0"/>
+                <w:sz w:val="18"/>
+              </w:rPr>
+              <w:t>—</w:t>
+            </w:r>
+          </w:p>
+        </w:tc>
+      </w:tr>
+      <w:tr>
+        <w:tc>
+          <w:tcPr>
+            <w:tcW w:type="dxa" w:w="1152"/>
+            <w:shd w:val="clear" w:color="auto" w:fill="FFF2CC"/>
+          </w:tcPr>
+          <w:p>
+            <w:r/>
+            <w:r>
+              <w:rPr>
+                <w:b/>
+                <w:sz w:val="18"/>
+              </w:rPr>
+              <w:t>Bloke</w:t>
+            </w:r>
+          </w:p>
+        </w:tc>
+        <w:tc>
+          <w:tcPr>
+            <w:tcW w:type="dxa" w:w="2160"/>
+          </w:tcPr>
+          <w:p>
+            <w:r/>
+            <w:r>
+              <w:rPr>
+                <w:b/>
+                <w:sz w:val="18"/>
+              </w:rPr>
+              <w:t>Meta/HDX Population</w:t>
+            </w:r>
+          </w:p>
+        </w:tc>
+        <w:tc>
+          <w:tcPr>
+            <w:tcW w:type="dxa" w:w="2736"/>
+          </w:tcPr>
+          <w:p>
+            <w:r/>
+            <w:r>
+              <w:rPr>
+                <w:b w:val="0"/>
+                <w:sz w:val="18"/>
+              </w:rPr>
+              <w:t>Nüfus — yüksek çözünürlüklü ham raster</w:t>
+            </w:r>
+          </w:p>
+        </w:tc>
+        <w:tc>
+          <w:tcPr>
+            <w:tcW w:type="dxa" w:w="2736"/>
+          </w:tcPr>
+          <w:p>
+            <w:r/>
+            <w:r>
+              <w:rPr>
+                <w:b w:val="0"/>
+                <w:sz w:val="18"/>
+              </w:rPr>
+              <w:t>Ülke başına ~10-11GB — Edge Function belleğine ve makine diskine sığmıyor</w:t>
+            </w:r>
+          </w:p>
+        </w:tc>
+        <w:tc>
+          <w:tcPr>
+            <w:tcW w:type="dxa" w:w="2736"/>
+          </w:tcPr>
+          <w:p>
+            <w:r/>
+            <w:r>
+              <w:rPr>
+                <w:b w:val="0"/>
+                <w:sz w:val="18"/>
+              </w:rPr>
+              <w:t>Python servisi (disk-streaming okuma) — VM'de yeterli disk olması şartıyla</w:t>
+            </w:r>
+          </w:p>
+        </w:tc>
+      </w:tr>
+      <w:tr>
+        <w:tc>
+          <w:tcPr>
+            <w:tcW w:type="dxa" w:w="1152"/>
+            <w:shd w:val="clear" w:color="auto" w:fill="FFF2CC"/>
+          </w:tcPr>
+          <w:p>
+            <w:r/>
+            <w:r>
+              <w:rPr>
+                <w:b/>
+                <w:sz w:val="18"/>
+              </w:rPr>
+              <w:t>Bloke</w:t>
+            </w:r>
+          </w:p>
+        </w:tc>
+        <w:tc>
+          <w:tcPr>
+            <w:tcW w:type="dxa" w:w="2160"/>
+          </w:tcPr>
+          <w:p>
+            <w:r/>
+            <w:r>
+              <w:rPr>
+                <w:b/>
+                <w:sz w:val="18"/>
+              </w:rPr>
+              <w:t>GHSL</w:t>
+            </w:r>
+          </w:p>
+        </w:tc>
+        <w:tc>
+          <w:tcPr>
+            <w:tcW w:type="dxa" w:w="2736"/>
+          </w:tcPr>
+          <w:p>
+            <w:r/>
+            <w:r>
+              <w:rPr>
+                <w:b w:val="0"/>
+                <w:sz w:val="18"/>
+              </w:rPr>
+              <w:t>Nüfus — 30 arcsecond (~1km) global raster</w:t>
+            </w:r>
+          </w:p>
+        </w:tc>
+        <w:tc>
+          <w:tcPr>
+            <w:tcW w:type="dxa" w:w="2736"/>
+          </w:tcPr>
+          <w:p>
+            <w:r/>
+            <w:r>
+              <w:rPr>
+                <w:b w:val="0"/>
+                <w:sz w:val="18"/>
+              </w:rPr>
+              <w:t>WORKER_RESOURCE_LIMIT + dosya LZW sıkıştırmalı/tiled (basit parser yetmiyor)</w:t>
+            </w:r>
+          </w:p>
+        </w:tc>
+        <w:tc>
+          <w:tcPr>
+            <w:tcW w:type="dxa" w:w="2736"/>
+          </w:tcPr>
+          <w:p>
+            <w:r/>
+            <w:r>
+              <w:rPr>
+                <w:b w:val="0"/>
+                <w:sz w:val="18"/>
+              </w:rPr>
+              <w:t>Python/GDAL servisi, ya da Edge Function kaynak tier'ını büyütmek</w:t>
+            </w:r>
+          </w:p>
+        </w:tc>
+      </w:tr>
+      <w:tr>
+        <w:tc>
+          <w:tcPr>
+            <w:tcW w:type="dxa" w:w="1152"/>
+            <w:shd w:val="clear" w:color="auto" w:fill="FFF2CC"/>
+          </w:tcPr>
+          <w:p>
+            <w:r/>
+            <w:r>
+              <w:rPr>
+                <w:b/>
+                <w:sz w:val="18"/>
+              </w:rPr>
+              <w:t>Bloke</w:t>
+            </w:r>
+          </w:p>
+        </w:tc>
+        <w:tc>
+          <w:tcPr>
+            <w:tcW w:type="dxa" w:w="2160"/>
+          </w:tcPr>
+          <w:p>
+            <w:r/>
+            <w:r>
+              <w:rPr>
+                <w:b/>
+                <w:sz w:val="18"/>
+              </w:rPr>
+              <w:t>GDO SPI (GPCC)</w:t>
+            </w:r>
+          </w:p>
+        </w:tc>
+        <w:tc>
+          <w:tcPr>
+            <w:tcW w:type="dxa" w:w="2736"/>
+          </w:tcPr>
+          <w:p>
+            <w:r/>
+            <w:r>
+              <w:rPr>
+                <w:b w:val="0"/>
+                <w:sz w:val="18"/>
+              </w:rPr>
+              <w:t>Kuraklık şiddeti — WCS API üzerinden</w:t>
+            </w:r>
+          </w:p>
+        </w:tc>
+        <w:tc>
+          <w:tcPr>
+            <w:tcW w:type="dxa" w:w="2736"/>
+          </w:tcPr>
+          <w:p>
+            <w:r/>
+            <w:r>
+              <w:rPr>
+                <w:b w:val="0"/>
+                <w:sz w:val="18"/>
+              </w:rPr>
+              <w:t>WORKER_RESOURCE_LIMIT + API gerçek ondalıklı SPI değil, 0-4 arası sınıflandırma kodu döndürüyor</w:t>
+            </w:r>
+          </w:p>
+        </w:tc>
+        <w:tc>
+          <w:tcPr>
+            <w:tcW w:type="dxa" w:w="2736"/>
+          </w:tcPr>
+          <w:p>
+            <w:r/>
+            <w:r>
+              <w:rPr>
+                <w:b w:val="0"/>
+                <w:sz w:val="18"/>
+              </w:rPr>
+              <w:t>Python servisiyle GDO'nun NetCDF arşivinden gerçek float veriyi çekmek</w:t>
+            </w:r>
+          </w:p>
+        </w:tc>
+      </w:tr>
+      <w:tr>
+        <w:tc>
+          <w:tcPr>
+            <w:tcW w:type="dxa" w:w="1152"/>
+            <w:shd w:val="clear" w:color="auto" w:fill="F4CCCC"/>
+          </w:tcPr>
+          <w:p>
+            <w:r/>
+            <w:r>
+              <w:rPr>
+                <w:b/>
+                <w:sz w:val="18"/>
+              </w:rPr>
+              <w:t>Değerlendirildi</w:t>
+            </w:r>
+          </w:p>
+        </w:tc>
+        <w:tc>
+          <w:tcPr>
+            <w:tcW w:type="dxa" w:w="2160"/>
+          </w:tcPr>
+          <w:p>
+            <w:r/>
+            <w:r>
+              <w:rPr>
+                <w:b/>
+                <w:sz w:val="18"/>
+              </w:rPr>
+              <w:t>GDO Soil Moisture Anomaly + FAPAR</w:t>
+            </w:r>
+          </w:p>
+        </w:tc>
+        <w:tc>
+          <w:tcPr>
+            <w:tcW w:type="dxa" w:w="2736"/>
+          </w:tcPr>
+          <w:p>
+            <w:r/>
+            <w:r>
+              <w:rPr>
+                <w:b w:val="0"/>
+                <w:sz w:val="18"/>
+              </w:rPr>
+              <w:t>Toprak nemi / bitki örtüsü kuraklık göstergeleri</w:t>
+            </w:r>
+          </w:p>
+        </w:tc>
+        <w:tc>
+          <w:tcPr>
+            <w:tcW w:type="dxa" w:w="2736"/>
+          </w:tcPr>
+          <w:p>
+            <w:r/>
+            <w:r>
+              <w:rPr>
+                <w:b w:val="0"/>
+                <w:sz w:val="18"/>
+              </w:rPr>
+              <w:t>Sadece NetCDF4/HDF5 formatında (~260MB/yıl) — pipeline sadece GeoTIFF okuyor</w:t>
+            </w:r>
+          </w:p>
+        </w:tc>
+        <w:tc>
+          <w:tcPr>
+            <w:tcW w:type="dxa" w:w="2736"/>
+          </w:tcPr>
+          <w:p>
+            <w:r/>
+            <w:r>
+              <w:rPr>
+                <w:b w:val="0"/>
+                <w:sz w:val="18"/>
+              </w:rPr>
+              <w:t>Python/GDAL servisi (spec 047, hazırlandı, bekletiliyor)</w:t>
+            </w:r>
+          </w:p>
+        </w:tc>
+      </w:tr>
+      <w:tr>
+        <w:tc>
+          <w:tcPr>
+            <w:tcW w:type="dxa" w:w="1152"/>
+            <w:shd w:val="clear" w:color="auto" w:fill="F4CCCC"/>
+          </w:tcPr>
+          <w:p>
+            <w:r/>
+            <w:r>
+              <w:rPr>
+                <w:b/>
+                <w:sz w:val="18"/>
+              </w:rPr>
+              <w:t>Değerlendirildi</w:t>
+            </w:r>
+          </w:p>
+        </w:tc>
+        <w:tc>
+          <w:tcPr>
+            <w:tcW w:type="dxa" w:w="2160"/>
+          </w:tcPr>
+          <w:p>
+            <w:r/>
+            <w:r>
+              <w:rPr>
+                <w:b/>
+                <w:sz w:val="18"/>
+              </w:rPr>
+              <w:t>INFORM Index</w:t>
+            </w:r>
+          </w:p>
+        </w:tc>
+        <w:tc>
+          <w:tcPr>
+            <w:tcW w:type="dxa" w:w="2736"/>
+          </w:tcPr>
+          <w:p>
+            <w:r/>
+            <w:r>
+              <w:rPr>
+                <w:b w:val="0"/>
+                <w:sz w:val="18"/>
+              </w:rPr>
+              <w:t>Ülke risk endeksi</w:t>
+            </w:r>
+          </w:p>
+        </w:tc>
+        <w:tc>
+          <w:tcPr>
+            <w:tcW w:type="dxa" w:w="2736"/>
+          </w:tcPr>
+          <w:p>
+            <w:r/>
+            <w:r>
+              <w:rPr>
+                <w:b w:val="0"/>
+                <w:sz w:val="18"/>
+              </w:rPr>
+              <w:t>API yok, UNDP tarafından statik/yıllık güncelleniyor</w:t>
+            </w:r>
+          </w:p>
+        </w:tc>
+        <w:tc>
+          <w:tcPr>
+            <w:tcW w:type="dxa" w:w="2736"/>
+          </w:tcPr>
+          <w:p>
+            <w:r/>
+            <w:r>
+              <w:rPr>
+                <w:b w:val="0"/>
+                <w:sz w:val="18"/>
+              </w:rPr>
+              <w:t>Otomatikleştirilemez — admin panelinden elle, yıllık güncelleme süreci (Python çözmez)</w:t>
+            </w:r>
+          </w:p>
+        </w:tc>
+      </w:tr>
+      <w:tr>
+        <w:tc>
+          <w:tcPr>
+            <w:tcW w:type="dxa" w:w="1152"/>
+            <w:shd w:val="clear" w:color="auto" w:fill="F4CCCC"/>
+          </w:tcPr>
+          <w:p>
+            <w:r/>
+            <w:r>
+              <w:rPr>
+                <w:b/>
+                <w:sz w:val="18"/>
+              </w:rPr>
+              <w:t>Değerlendirildi</w:t>
+            </w:r>
+          </w:p>
+        </w:tc>
+        <w:tc>
+          <w:tcPr>
+            <w:tcW w:type="dxa" w:w="2160"/>
+          </w:tcPr>
+          <w:p>
+            <w:r/>
+            <w:r>
+              <w:rPr>
+                <w:b/>
+                <w:sz w:val="18"/>
+              </w:rPr>
+              <w:t>JRC GFM</w:t>
+            </w:r>
+          </w:p>
+        </w:tc>
+        <w:tc>
+          <w:tcPr>
+            <w:tcW w:type="dxa" w:w="2736"/>
+          </w:tcPr>
+          <w:p>
+            <w:r/>
+            <w:r>
+              <w:rPr>
+                <w:b w:val="0"/>
+                <w:sz w:val="18"/>
+              </w:rPr>
+              <w:t>Sel tahmini</w:t>
+            </w:r>
+          </w:p>
+        </w:tc>
+        <w:tc>
+          <w:tcPr>
+            <w:tcW w:type="dxa" w:w="2736"/>
+          </w:tcPr>
+          <w:p>
+            <w:r/>
+            <w:r>
+              <w:rPr>
+                <w:b w:val="0"/>
+                <w:sz w:val="18"/>
+              </w:rPr>
+              <w:t>GloFAS ile aynı işi yapıyor, kayıt/onay gerektiriyor</w:t>
+            </w:r>
+          </w:p>
+        </w:tc>
+        <w:tc>
+          <w:tcPr>
+            <w:tcW w:type="dxa" w:w="2736"/>
+          </w:tcPr>
+          <w:p>
+            <w:r/>
+            <w:r>
+              <w:rPr>
+                <w:b w:val="0"/>
+                <w:sz w:val="18"/>
+              </w:rPr>
+              <w:t>Gerek yok — kasıtlı olarak atlandı (Python çözmez)</w:t>
+            </w:r>
+          </w:p>
+        </w:tc>
+      </w:tr>
+    </w:tbl>
+    <w:p>
+      <w:r>
+        <w:rPr>
+          <w:i/>
+          <w:color w:val="808080"/>
+          <w:sz w:val="17"/>
+        </w:rPr>
+        <w:br/>
+        <w:t>Not: PostGIS raster (GDAL sürücüleri) denemesi bu tabloya dahil edilmedi — bir veri kaynağı değil, GHSL/GDO SPI için denenen bir altyapı yaklaşımıydı. Supabase'in yönetilen veritabanında superuser izni gerektirdiği için (permission denied) kapandı; Python servisi kurulunca zaten ihtiyaç kalmıyor.</w:t>
+      </w:r>
+    </w:p>
     <w:sectPr>
       <w:pgSz w:w="12240" w:h="15840" w:orient="portrait"/>
       <w:pgMar w:top="1440" w:right="1440" w:bottom="1440" w:left="1440" w:header="708" w:footer="708" w:gutter="0"/>

</xml_diff>